<commit_message>
Add prospect and client account roles
</commit_message>
<xml_diff>
--- a/public/legal/orbit-systems-ai-customer-support-policy.docx
+++ b/public/legal/orbit-systems-ai-customer-support-policy.docx
@@ -192,42 +192,17 @@
             <w:r>
               <w:rPr>
                 <w:rFonts w:ascii="Aptos" w:hAnsi="Aptos"/>
-                <w:b/>
+                <w:b w:val="0"/>
                 <w:i w:val="0"/>
-                <w:color w:val="9C2B2E"/>
+                <w:color w:val="132A46"/>
                 <w:sz w:val="20"/>
               </w:rPr>
-              <w:t>[INSERT SUPPORT PHONE]</w:t>
+              <w:t>(213) 279-7175</w:t>
             </w:r>
           </w:p>
         </w:tc>
       </w:tr>
     </w:tbl>
-    <w:p>
-      <w:pPr>
-        <w:spacing w:before="200" w:after="200"/>
-      </w:pPr>
-      <w:r>
-        <w:rPr>
-          <w:rFonts w:ascii="Aptos" w:hAnsi="Aptos"/>
-          <w:b/>
-          <w:i w:val="0"/>
-          <w:color w:val="9C2B2E"/>
-          <w:sz w:val="18"/>
-        </w:rPr>
-        <w:t xml:space="preserve">PUBLISHING NOTE  </w:t>
-      </w:r>
-      <w:r>
-        <w:rPr>
-          <w:rFonts w:ascii="Aptos" w:hAnsi="Aptos"/>
-          <w:b w:val="0"/>
-          <w:i w:val="0"/>
-          <w:color w:val="9C2B2E"/>
-          <w:sz w:val="18"/>
-        </w:rPr>
-        <w:t>Replace every bracketed field and confirm the refund/cancellation terms match your customer agreements before posting this policy or submitting its URL to Stripe.</w:t>
-      </w:r>
-    </w:p>
     <w:p>
       <w:pPr>
         <w:pStyle w:val="Heading1"/>
@@ -491,12 +466,12 @@
             <w:r>
               <w:rPr>
                 <w:rFonts w:ascii="Aptos" w:hAnsi="Aptos"/>
-                <w:b/>
+                <w:b w:val="0"/>
                 <w:i w:val="0"/>
-                <w:color w:val="9C2B2E"/>
+                <w:color w:val="1F2937"/>
                 <w:sz w:val="18"/>
               </w:rPr>
-              <w:t>[INSERT SUPPORT PHONE]</w:t>
+              <w:t>(213) 279-7175</w:t>
             </w:r>
           </w:p>
         </w:tc>
@@ -565,12 +540,12 @@
             <w:r>
               <w:rPr>
                 <w:rFonts w:ascii="Aptos" w:hAnsi="Aptos"/>
-                <w:b/>
+                <w:b w:val="0"/>
                 <w:i w:val="0"/>
-                <w:color w:val="9C2B2E"/>
+                <w:color w:val="1F2937"/>
                 <w:sz w:val="18"/>
               </w:rPr>
-              <w:t>[INSERT SUPPORT URL]</w:t>
+              <w:t>https://orbitsystems.ai/member/support</w:t>
             </w:r>
           </w:p>
         </w:tc>
@@ -639,12 +614,12 @@
             <w:r>
               <w:rPr>
                 <w:rFonts w:ascii="Aptos" w:hAnsi="Aptos"/>
-                <w:b/>
+                <w:b w:val="0"/>
                 <w:i w:val="0"/>
-                <w:color w:val="9C2B2E"/>
+                <w:color w:val="1F2937"/>
                 <w:sz w:val="18"/>
               </w:rPr>
-              <w:t>[INSERT ABUSE EMAIL]</w:t>
+              <w:t>support@orbitsystems.ai</w:t>
             </w:r>
           </w:p>
         </w:tc>
@@ -686,7 +661,7 @@
           <w:color w:val="1F2937"/>
           <w:sz w:val="21"/>
         </w:rPr>
-        <w:t>Standard support hours: [INSERT DAYS, HOURS, AND TIME ZONE]. Requests received outside standard hours are logged on the next business day unless the customer has contracted for 24/7 or after-hours support.</w:t>
+        <w:t>Standard support hours: Monday through Friday, 10:00 a.m. to 4:00 p.m. Eastern Time. Requests received outside standard hours are logged on the next business day unless the customer has contracted for 24/7 or after-hours support.</w:t>
       </w:r>
     </w:p>
     <w:p>
@@ -1816,7 +1791,7 @@
           <w:color w:val="1F2937"/>
           <w:sz w:val="21"/>
         </w:rPr>
-        <w:t>Orbit uses support communications and diagnostic records to authenticate users, provide and improve support, secure the Services, prevent abuse, meet legal obligations, and document account activity. Handling of personal information is also governed by Orbit's Privacy Policy at [INSERT PRIVACY POLICY URL]. Call recordings or transcripts are accessed only when authorized and reasonably necessary for support, security, quality, or legal purposes.</w:t>
+        <w:t>Orbit uses support communications and diagnostic records to authenticate users, provide and improve support, secure the Services, prevent abuse, meet legal obligations, and document account activity. Handling of personal information is also governed by Orbit's Privacy Policy at https://orbitsystems.ai/terms. Call recordings or transcripts are accessed only when authorized and reasonably necessary for support, security, quality, or legal purposes.</w:t>
       </w:r>
     </w:p>
     <w:p>
@@ -1839,7 +1814,7 @@
           <w:color w:val="1F2937"/>
           <w:sz w:val="21"/>
         </w:rPr>
-        <w:t>Orbit may update this policy as its Services, support practices, provider requirements, or applicable laws change. The current version will be posted at [INSERT CUSTOMER SUPPORT POLICY URL] with its effective date. Material changes will apply prospectively unless immediate changes are needed for security, legal, carrier, or fraud-prevention reasons.</w:t>
+        <w:t>Orbit may update this policy as its Services, support practices, provider requirements, or applicable laws change. The current version will display its effective date. Material changes will apply prospectively unless immediate changes are needed for security, legal, carrier, or fraud-prevention reasons.</w:t>
       </w:r>
     </w:p>
     <w:p>
@@ -1868,7 +1843,7 @@
         <w:br/>
         <w:t>Billing: finance@orbitsystems.ai | Legal notices: legal@orbitsystems.ai</w:t>
         <w:br/>
-        <w:t>Telephone: [INSERT SUPPORT PHONE] | Website: https://www.orbitsystems.ai</w:t>
+        <w:t>Telephone: (213) 279-7175 | Website: https://www.orbitsystems.ai</w:t>
       </w:r>
     </w:p>
     <w:sectPr>

</xml_diff>